<commit_message>
Alteração no formato de arquivo da submissão. Alteração no modelo do artigo.
</commit_message>
<xml_diff>
--- a/Modelo de artigo.docx
+++ b/Modelo de artigo.docx
@@ -85,18 +85,26 @@
       <w:r>
         <w:rPr>
           <w:rFonts w:ascii="Times New Roman" w:eastAsia="Arial" w:hAnsi="Times New Roman" w:cs="Times New Roman"/>
+          <w:b/>
+          <w:color w:val="FF0000"/>
+        </w:rPr>
+        <w:t>5</w:t>
+      </w:r>
+      <w:r>
+        <w:rPr>
+          <w:rFonts w:ascii="Times New Roman" w:eastAsia="Arial" w:hAnsi="Times New Roman" w:cs="Times New Roman"/>
+          <w:b/>
+          <w:color w:val="FF0000"/>
+        </w:rPr>
+        <w:t xml:space="preserve"> e 16 páginas</w:t>
+      </w:r>
+      <w:r>
+        <w:rPr>
+          <w:rFonts w:ascii="Times New Roman" w:eastAsia="Arial" w:hAnsi="Times New Roman" w:cs="Times New Roman"/>
           <w:bCs/>
           <w:color w:val="FF0000"/>
         </w:rPr>
-        <w:t>5</w:t>
-      </w:r>
-      <w:r>
-        <w:rPr>
-          <w:rFonts w:ascii="Times New Roman" w:eastAsia="Arial" w:hAnsi="Times New Roman" w:cs="Times New Roman"/>
-          <w:bCs/>
-          <w:color w:val="FF0000"/>
-        </w:rPr>
-        <w:t xml:space="preserve"> e 16 páginas.</w:t>
+        <w:t>.</w:t>
       </w:r>
     </w:p>
     <w:p>
@@ -120,10 +128,18 @@
       <w:r>
         <w:rPr>
           <w:rFonts w:ascii="Times New Roman" w:eastAsia="Arial" w:hAnsi="Times New Roman" w:cs="Times New Roman"/>
+          <w:b/>
+          <w:color w:val="FF0000"/>
+        </w:rPr>
+        <w:t>Exclua</w:t>
+      </w:r>
+      <w:r>
+        <w:rPr>
+          <w:rFonts w:ascii="Times New Roman" w:eastAsia="Arial" w:hAnsi="Times New Roman" w:cs="Times New Roman"/>
           <w:bCs/>
           <w:color w:val="FF0000"/>
         </w:rPr>
-        <w:t>Siga o formato desse arquivo.</w:t>
+        <w:t xml:space="preserve"> as frases de orientações em vermelho.</w:t>
       </w:r>
     </w:p>
     <w:p>
@@ -150,7 +166,15 @@
           <w:bCs/>
           <w:color w:val="FF0000"/>
         </w:rPr>
-        <w:t>Exclua as frases de orientações em vermelho.</w:t>
+        <w:t xml:space="preserve">Seu texto do trabalho deve ser na cor </w:t>
+      </w:r>
+      <w:r>
+        <w:rPr>
+          <w:rFonts w:ascii="Times New Roman" w:eastAsia="Arial" w:hAnsi="Times New Roman" w:cs="Times New Roman"/>
+          <w:b/>
+          <w:color w:val="FF0000"/>
+        </w:rPr>
+        <w:t>preta/automática.</w:t>
       </w:r>
     </w:p>
     <w:p>
@@ -167,17 +191,71 @@
         <w:jc w:val="both"/>
         <w:rPr>
           <w:rFonts w:ascii="Times New Roman" w:hAnsi="Times New Roman" w:cs="Times New Roman"/>
-          <w:sz w:val="20"/>
-          <w:szCs w:val="20"/>
-        </w:rPr>
-      </w:pPr>
-      <w:r>
-        <w:rPr>
-          <w:rFonts w:ascii="Times New Roman" w:eastAsia="Arial" w:hAnsi="Times New Roman" w:cs="Times New Roman"/>
-          <w:bCs/>
-          <w:color w:val="FF0000"/>
-        </w:rPr>
-        <w:t>Seu texto do trabalho deve ser na cor preta/automática.</w:t>
+          <w:color w:val="EE0000"/>
+        </w:rPr>
+      </w:pPr>
+      <w:r>
+        <w:rPr>
+          <w:rFonts w:ascii="Times New Roman" w:hAnsi="Times New Roman" w:cs="Times New Roman"/>
+          <w:color w:val="EE0000"/>
+        </w:rPr>
+        <w:t xml:space="preserve">Os títulos das seções devem ser em Fonte Times New Roman, negrito, tamanho 12, numeradas à esquerda.  </w:t>
+      </w:r>
+      <w:r>
+        <w:rPr>
+          <w:rFonts w:ascii="Times New Roman" w:hAnsi="Times New Roman" w:cs="Times New Roman"/>
+          <w:color w:val="EE0000"/>
+        </w:rPr>
+        <w:t xml:space="preserve">Em caso de </w:t>
+      </w:r>
+      <w:r>
+        <w:rPr>
+          <w:rFonts w:ascii="Times New Roman" w:hAnsi="Times New Roman" w:cs="Times New Roman"/>
+          <w:color w:val="EE0000"/>
+        </w:rPr>
+        <w:t>subseções</w:t>
+      </w:r>
+      <w:r>
+        <w:rPr>
+          <w:rFonts w:ascii="Times New Roman" w:hAnsi="Times New Roman" w:cs="Times New Roman"/>
+          <w:color w:val="EE0000"/>
+        </w:rPr>
+        <w:t>,</w:t>
+      </w:r>
+      <w:r>
+        <w:rPr>
+          <w:rFonts w:ascii="Times New Roman" w:hAnsi="Times New Roman" w:cs="Times New Roman"/>
+          <w:color w:val="EE0000"/>
+        </w:rPr>
+        <w:t xml:space="preserve"> utiliz</w:t>
+      </w:r>
+      <w:r>
+        <w:rPr>
+          <w:rFonts w:ascii="Times New Roman" w:hAnsi="Times New Roman" w:cs="Times New Roman"/>
+          <w:color w:val="EE0000"/>
+        </w:rPr>
+        <w:t>e</w:t>
+      </w:r>
+      <w:r>
+        <w:rPr>
+          <w:rFonts w:ascii="Times New Roman" w:hAnsi="Times New Roman" w:cs="Times New Roman"/>
+          <w:color w:val="EE0000"/>
+        </w:rPr>
+        <w:t xml:space="preserve"> o tamanho 12, sem negrito, alinhamento à esquerda, espaçamento simples. Não é recomendado que uma seção tenha apenas uma subseção</w:t>
+      </w:r>
+      <w:r>
+        <w:rPr>
+          <w:rFonts w:ascii="Times New Roman" w:hAnsi="Times New Roman" w:cs="Times New Roman"/>
+          <w:color w:val="EE0000"/>
+        </w:rPr>
+        <w:t xml:space="preserve"> – nesse caso, use somente a seção de tópico principal</w:t>
+      </w:r>
+      <w:r>
+        <w:rPr>
+          <w:rFonts w:ascii="Times New Roman" w:hAnsi="Times New Roman" w:cs="Times New Roman"/>
+          <w:color w:val="EE0000"/>
+        </w:rPr>
+        <w:t xml:space="preserve">. </w:t>
       </w:r>
     </w:p>
     <w:p>
@@ -202,56 +280,70 @@
           <w:rFonts w:ascii="Times New Roman" w:hAnsi="Times New Roman" w:cs="Times New Roman"/>
           <w:color w:val="EE0000"/>
         </w:rPr>
-        <w:t xml:space="preserve">Os títulos das seções devem ser em Fonte Times New Roman, negrito, tamanho 12, numeradas à esquerda.  </w:t>
+        <w:t xml:space="preserve">Os trabalhos submetidos à </w:t>
       </w:r>
       <w:r>
         <w:rPr>
           <w:rFonts w:ascii="Times New Roman" w:hAnsi="Times New Roman" w:cs="Times New Roman"/>
           <w:color w:val="EE0000"/>
         </w:rPr>
-        <w:t xml:space="preserve">Em caso de </w:t>
+        <w:t>32</w:t>
       </w:r>
       <w:r>
         <w:rPr>
           <w:rFonts w:ascii="Times New Roman" w:hAnsi="Times New Roman" w:cs="Times New Roman"/>
           <w:color w:val="EE0000"/>
         </w:rPr>
-        <w:t>subseções</w:t>
+        <w:t xml:space="preserve">ª </w:t>
       </w:r>
       <w:r>
         <w:rPr>
           <w:rFonts w:ascii="Times New Roman" w:hAnsi="Times New Roman" w:cs="Times New Roman"/>
           <w:color w:val="EE0000"/>
         </w:rPr>
-        <w:t>,</w:t>
+        <w:t xml:space="preserve">Semana do Contador </w:t>
       </w:r>
       <w:r>
         <w:rPr>
           <w:rFonts w:ascii="Times New Roman" w:hAnsi="Times New Roman" w:cs="Times New Roman"/>
           <w:color w:val="EE0000"/>
         </w:rPr>
-        <w:t xml:space="preserve"> utiliz</w:t>
+        <w:t xml:space="preserve">de Cianorte </w:t>
       </w:r>
       <w:r>
         <w:rPr>
           <w:rFonts w:ascii="Times New Roman" w:hAnsi="Times New Roman" w:cs="Times New Roman"/>
           <w:color w:val="EE0000"/>
         </w:rPr>
-        <w:t>e</w:t>
+        <w:t xml:space="preserve">devem respeitar o formato </w:t>
       </w:r>
       <w:r>
         <w:rPr>
           <w:rFonts w:ascii="Times New Roman" w:hAnsi="Times New Roman" w:cs="Times New Roman"/>
           <w:color w:val="EE0000"/>
         </w:rPr>
-        <w:t xml:space="preserve"> o tamanho 12, sem negrito, alinhamento à esquerda, espaçamento simples. Não é recomendado que uma seção tenha apenas uma subseção</w:t>
+        <w:t>dess</w:t>
       </w:r>
       <w:r>
         <w:rPr>
           <w:rFonts w:ascii="Times New Roman" w:hAnsi="Times New Roman" w:cs="Times New Roman"/>
           <w:color w:val="EE0000"/>
         </w:rPr>
-        <w:t xml:space="preserve"> – nesse caso, use somente a seção de tópico principal</w:t>
+        <w:t xml:space="preserve">e documento. </w:t>
+      </w:r>
+      <w:r>
+        <w:rPr>
+          <w:rFonts w:ascii="Times New Roman" w:hAnsi="Times New Roman" w:cs="Times New Roman"/>
+          <w:color w:val="EE0000"/>
+        </w:rPr>
+        <w:t>Se for preciso, apague o texto e reescreva</w:t>
+      </w:r>
+      <w:r>
+        <w:rPr>
+          <w:rFonts w:ascii="Times New Roman" w:hAnsi="Times New Roman" w:cs="Times New Roman"/>
+          <w:color w:val="EE0000"/>
+        </w:rPr>
+        <w:t xml:space="preserve"> o seu</w:t>
       </w:r>
       <w:r>
         <w:rPr>
@@ -283,84 +375,81 @@
           <w:rFonts w:ascii="Times New Roman" w:hAnsi="Times New Roman" w:cs="Times New Roman"/>
           <w:color w:val="EE0000"/>
         </w:rPr>
-        <w:t xml:space="preserve">Os trabalhos submetidos à </w:t>
+        <w:t xml:space="preserve">Os trabalhos </w:t>
       </w:r>
       <w:r>
         <w:rPr>
           <w:rFonts w:ascii="Times New Roman" w:hAnsi="Times New Roman" w:cs="Times New Roman"/>
           <w:color w:val="EE0000"/>
         </w:rPr>
-        <w:t>32</w:t>
+        <w:t>serão objeto de um processo de para avaliação</w:t>
       </w:r>
       <w:r>
         <w:rPr>
           <w:rFonts w:ascii="Times New Roman" w:hAnsi="Times New Roman" w:cs="Times New Roman"/>
           <w:color w:val="EE0000"/>
         </w:rPr>
-        <w:t xml:space="preserve">ª </w:t>
+        <w:t>.</w:t>
       </w:r>
       <w:r>
         <w:rPr>
           <w:rFonts w:ascii="Times New Roman" w:hAnsi="Times New Roman" w:cs="Times New Roman"/>
           <w:color w:val="EE0000"/>
         </w:rPr>
-        <w:t xml:space="preserve">Semana do Contador </w:t>
+        <w:t xml:space="preserve"> </w:t>
       </w:r>
       <w:r>
         <w:rPr>
           <w:rFonts w:ascii="Times New Roman" w:hAnsi="Times New Roman" w:cs="Times New Roman"/>
           <w:color w:val="EE0000"/>
         </w:rPr>
-        <w:t xml:space="preserve">de Cianorte </w:t>
+        <w:t xml:space="preserve">Sendo assim, o arquivo </w:t>
       </w:r>
       <w:r>
         <w:rPr>
           <w:rFonts w:ascii="Times New Roman" w:hAnsi="Times New Roman" w:cs="Times New Roman"/>
           <w:color w:val="EE0000"/>
         </w:rPr>
-        <w:t xml:space="preserve">devem respeitar o formato </w:t>
+        <w:t xml:space="preserve">não pode conter referência </w:t>
       </w:r>
       <w:r>
         <w:rPr>
           <w:rFonts w:ascii="Times New Roman" w:hAnsi="Times New Roman" w:cs="Times New Roman"/>
           <w:color w:val="EE0000"/>
         </w:rPr>
-        <w:t>dess</w:t>
+        <w:t xml:space="preserve">ou nome </w:t>
       </w:r>
       <w:r>
         <w:rPr>
           <w:rFonts w:ascii="Times New Roman" w:hAnsi="Times New Roman" w:cs="Times New Roman"/>
           <w:color w:val="EE0000"/>
         </w:rPr>
-        <w:t xml:space="preserve">e documento. </w:t>
-      </w:r>
-      <w:r>
+        <w:t xml:space="preserve">que identifique os autores. </w:t>
+      </w:r>
+    </w:p>
+    <w:p>
+      <w:pPr>
+        <w:pStyle w:val="PargrafodaLista"/>
+        <w:numPr>
+          <w:ilvl w:val="0"/>
+          <w:numId w:val="2"/>
+        </w:numPr>
+        <w:tabs>
+          <w:tab w:val="left" w:pos="810"/>
+        </w:tabs>
+        <w:spacing w:after="0" w:line="240" w:lineRule="auto"/>
+        <w:jc w:val="both"/>
         <w:rPr>
           <w:rFonts w:ascii="Times New Roman" w:hAnsi="Times New Roman" w:cs="Times New Roman"/>
           <w:color w:val="EE0000"/>
         </w:rPr>
-        <w:t>Se for preciso, apague o texto e reescreva</w:t>
-      </w:r>
+      </w:pPr>
       <w:r>
         <w:rPr>
           <w:rFonts w:ascii="Times New Roman" w:hAnsi="Times New Roman" w:cs="Times New Roman"/>
           <w:color w:val="EE0000"/>
         </w:rPr>
-        <w:t xml:space="preserve"> o seu</w:t>
-      </w:r>
-      <w:r>
-        <w:rPr>
-          <w:rFonts w:ascii="Times New Roman" w:hAnsi="Times New Roman" w:cs="Times New Roman"/>
-          <w:color w:val="EE0000"/>
-        </w:rPr>
-        <w:t xml:space="preserve">. </w:t>
-      </w:r>
-      <w:r>
-        <w:rPr>
-          <w:rFonts w:ascii="Times New Roman" w:hAnsi="Times New Roman" w:cs="Times New Roman"/>
-          <w:color w:val="EE0000"/>
-        </w:rPr>
-        <w:t>Todos os artigos serão objeto de um processo de para avaliação este não pode conter qualquer referência que identifique os autores. Portanto, ao submeter, certifique-se que excluiu as propriedades do arquivo.</w:t>
+        <w:t>Envie esse arquivo em formato Word docx.</w:t>
       </w:r>
     </w:p>
     <w:p>
@@ -479,81 +568,6 @@
     <w:p>
       <w:pPr>
         <w:spacing w:after="0" w:line="240" w:lineRule="auto"/>
-        <w:jc w:val="right"/>
-        <w:rPr>
-          <w:rFonts w:ascii="Times New Roman" w:eastAsia="Arial" w:hAnsi="Times New Roman" w:cs="Times New Roman"/>
-        </w:rPr>
-      </w:pPr>
-      <w:r>
-        <w:rPr>
-          <w:rFonts w:ascii="Times New Roman" w:eastAsia="Arial" w:hAnsi="Times New Roman" w:cs="Times New Roman"/>
-        </w:rPr>
-        <w:t>Autor 1 (e-mail)</w:t>
-      </w:r>
-    </w:p>
-    <w:p>
-      <w:pPr>
-        <w:spacing w:after="0" w:line="240" w:lineRule="auto"/>
-        <w:jc w:val="right"/>
-        <w:rPr>
-          <w:rFonts w:ascii="Times New Roman" w:eastAsia="Arial" w:hAnsi="Times New Roman" w:cs="Times New Roman"/>
-        </w:rPr>
-      </w:pPr>
-      <w:r>
-        <w:rPr>
-          <w:rFonts w:ascii="Times New Roman" w:eastAsia="Arial" w:hAnsi="Times New Roman" w:cs="Times New Roman"/>
-        </w:rPr>
-        <w:t>Autor 2 (e-mail)</w:t>
-      </w:r>
-    </w:p>
-    <w:p>
-      <w:pPr>
-        <w:spacing w:after="0" w:line="240" w:lineRule="auto"/>
-        <w:jc w:val="right"/>
-        <w:rPr>
-          <w:rFonts w:ascii="Times New Roman" w:eastAsia="Arial" w:hAnsi="Times New Roman" w:cs="Times New Roman"/>
-        </w:rPr>
-      </w:pPr>
-      <w:r>
-        <w:rPr>
-          <w:rFonts w:ascii="Times New Roman" w:eastAsia="Arial" w:hAnsi="Times New Roman" w:cs="Times New Roman"/>
-        </w:rPr>
-        <w:t>Autor 3 (e-mail)</w:t>
-      </w:r>
-    </w:p>
-    <w:p>
-      <w:pPr>
-        <w:spacing w:after="0" w:line="240" w:lineRule="auto"/>
-        <w:jc w:val="right"/>
-        <w:rPr>
-          <w:rFonts w:ascii="Times New Roman" w:eastAsia="Arial" w:hAnsi="Times New Roman" w:cs="Times New Roman"/>
-        </w:rPr>
-      </w:pPr>
-      <w:r>
-        <w:rPr>
-          <w:rFonts w:ascii="Times New Roman" w:eastAsia="Arial" w:hAnsi="Times New Roman" w:cs="Times New Roman"/>
-        </w:rPr>
-        <w:t>Permitido a</w:t>
-      </w:r>
-      <w:r>
-        <w:rPr>
-          <w:rFonts w:ascii="Times New Roman" w:eastAsia="Arial" w:hAnsi="Times New Roman" w:cs="Times New Roman"/>
-        </w:rPr>
-        <w:t>té 6 autores</w:t>
-      </w:r>
-    </w:p>
-    <w:p>
-      <w:pPr>
-        <w:spacing w:after="0" w:line="240" w:lineRule="auto"/>
-        <w:jc w:val="right"/>
-        <w:rPr>
-          <w:rFonts w:ascii="Times New Roman" w:eastAsia="Arial" w:hAnsi="Times New Roman" w:cs="Times New Roman"/>
-        </w:rPr>
-      </w:pPr>
-    </w:p>
-    <w:p>
-      <w:pPr>
-        <w:spacing w:after="0" w:line="240" w:lineRule="auto"/>
         <w:rPr>
           <w:rFonts w:ascii="Times New Roman" w:eastAsia="Arial" w:hAnsi="Times New Roman" w:cs="Times New Roman"/>
           <w:color w:val="EE0000"/>
@@ -1010,7 +1024,6 @@
           <w:rFonts w:ascii="Times New Roman" w:eastAsia="Arial" w:hAnsi="Times New Roman" w:cs="Times New Roman"/>
           <w:color w:val="EE0000"/>
         </w:rPr>
-        <w:lastRenderedPageBreak/>
         <w:t>Este</w:t>
       </w:r>
       <w:r>
@@ -2498,7 +2511,6 @@
           <w:noProof/>
           <w:color w:val="EE0000"/>
         </w:rPr>
-        <w:lastRenderedPageBreak/>
         <w:drawing>
           <wp:anchor distT="0" distB="0" distL="0" distR="0" simplePos="0" relativeHeight="251659264" behindDoc="0" locked="0" layoutInCell="1" hidden="0" allowOverlap="1" wp14:anchorId="7F963543" wp14:editId="2182B587">
             <wp:simplePos x="0" y="0"/>

</xml_diff>